<commit_message>
Generate STROBE flow via mysterycall_strobe_flow(); embed as manuscript Figure 1
Replaces the Graphviz .dot STROBE (which needed headless rendering) with
mysterycall_strobe_flow(), which returns a native ggplot -> PNG. Waterfall:
960 calls -> 749 complete -> 731 analytic -> 731 access / 430 timeliness.
scripts/strobe_flow.R documents the counts; manuscript.Rmd embeds it as Figure 1
(re-rendered, 5 figures now). Note: the function's custom-label path errors
(subscript out of bounds), so its accurate default labels are used.

Co-Authored-By: Claude Opus 4.8 (1M context) <noreply@anthropic.com>
</commit_message>
<xml_diff>
--- a/manuscript_output/manuscript.docx
+++ b/manuscript_output/manuscript.docx
@@ -8353,7 +8353,7 @@
       </w:r>
     </w:p>
     <w:bookmarkEnd w:id="29"/>
-    <w:bookmarkStart w:id="36" w:name="figures"/>
+    <w:bookmarkStart w:id="39" w:name="figures"/>
     <w:p>
       <w:pPr>
         <w:pStyle w:val="Heading2"/>
@@ -8381,7 +8381,7 @@
           <w:i/>
           <w:iCs/>
         </w:rPr>
-        <w:t xml:space="preserve">Rendered from</w:t>
+        <w:t xml:space="preserve">Generated with</w:t>
       </w:r>
       <w:r>
         <w:rPr>
@@ -8396,33 +8396,14 @@
           <w:i/>
           <w:iCs/>
         </w:rPr>
-        <w:t xml:space="preserve">model_output/strobe_flow.dot</w:t>
+        <w:t xml:space="preserve">mysterycall_strobe_flow()</w:t>
       </w:r>
       <w:r>
         <w:rPr>
           <w:i/>
           <w:iCs/>
         </w:rPr>
-        <w:t xml:space="preserve"> </w:t>
-      </w:r>
-      <w:r>
-        <w:rPr>
-          <w:i/>
-          <w:iCs/>
-        </w:rPr>
-        <w:t xml:space="preserve">with Graphviz.</w:t>
-      </w:r>
-    </w:p>
-    <w:p>
-      <w:pPr>
-        <w:pStyle w:val="BodyText"/>
-      </w:pPr>
-      <w:r>
-        <w:rPr>
-          <w:b/>
-          <w:bCs/>
-        </w:rPr>
-        <w:t xml:space="preserve">Figure 2. Access (odds ratios) and timeliness (incidence rate ratios).</w:t>
+        <w:t xml:space="preserve">.</w:t>
       </w:r>
     </w:p>
     <w:p>
@@ -8432,20 +8413,87 @@
       <w:r>
         <w:drawing>
           <wp:inline>
-            <wp:extent cx="5334000" cy="3200400"/>
+            <wp:extent cx="5334000" cy="6519333"/>
             <wp:effectExtent b="0" l="0" r="0" t="0"/>
-            <wp:docPr descr="Figure 2. Adjusted access and timeliness effects." title="" id="31" name="Picture"/>
+            <wp:docPr descr="Figure 1. Participant flow from calls placed to the two analytic samples." title="" id="31" name="Picture"/>
             <a:graphic>
               <a:graphicData uri="http://schemas.openxmlformats.org/drawingml/2006/picture">
                 <pic:pic>
                   <pic:nvPicPr>
-                    <pic:cNvPr descr="model_output/forest_access_timeliness.png" id="32" name="Picture"/>
+                    <pic:cNvPr descr="model_output/strobe_flow_mysterycall.png" id="32" name="Picture"/>
                     <pic:cNvPicPr>
                       <a:picLocks noChangeArrowheads="1" noChangeAspect="1"/>
                     </pic:cNvPicPr>
                   </pic:nvPicPr>
                   <pic:blipFill>
                     <a:blip r:embed="rId30"/>
+                    <a:stretch>
+                      <a:fillRect/>
+                    </a:stretch>
+                  </pic:blipFill>
+                  <pic:spPr bwMode="auto">
+                    <a:xfrm>
+                      <a:off x="0" y="0"/>
+                      <a:ext cx="5334000" cy="6519333"/>
+                    </a:xfrm>
+                    <a:prstGeom prst="rect">
+                      <a:avLst/>
+                    </a:prstGeom>
+                    <a:noFill/>
+                    <a:ln w="9525">
+                      <a:noFill/>
+                      <a:headEnd/>
+                      <a:tailEnd/>
+                    </a:ln>
+                  </pic:spPr>
+                </pic:pic>
+              </a:graphicData>
+            </a:graphic>
+          </wp:inline>
+        </w:drawing>
+      </w:r>
+    </w:p>
+    <w:p>
+      <w:pPr>
+        <w:pStyle w:val="ImageCaption"/>
+      </w:pPr>
+      <w:r>
+        <w:t xml:space="preserve">Figure 1. Participant flow from calls placed to the two analytic samples.</w:t>
+      </w:r>
+    </w:p>
+    <w:p>
+      <w:pPr>
+        <w:pStyle w:val="BodyText"/>
+      </w:pPr>
+      <w:r>
+        <w:rPr>
+          <w:b/>
+          <w:bCs/>
+        </w:rPr>
+        <w:t xml:space="preserve">Figure 2. Access (odds ratios) and timeliness (incidence rate ratios).</w:t>
+      </w:r>
+    </w:p>
+    <w:p>
+      <w:pPr>
+        <w:pStyle w:val="CaptionedFigure"/>
+      </w:pPr>
+      <w:r>
+        <w:drawing>
+          <wp:inline>
+            <wp:extent cx="5334000" cy="3200400"/>
+            <wp:effectExtent b="0" l="0" r="0" t="0"/>
+            <wp:docPr descr="Figure 2. Adjusted access and timeliness effects." title="" id="34" name="Picture"/>
+            <a:graphic>
+              <a:graphicData uri="http://schemas.openxmlformats.org/drawingml/2006/picture">
+                <pic:pic>
+                  <pic:nvPicPr>
+                    <pic:cNvPr descr="model_output/forest_access_timeliness.png" id="35" name="Picture"/>
+                    <pic:cNvPicPr>
+                      <a:picLocks noChangeArrowheads="1" noChangeAspect="1"/>
+                    </pic:cNvPicPr>
+                  </pic:nvPicPr>
+                  <pic:blipFill>
+                    <a:blip r:embed="rId33"/>
                     <a:stretch>
                       <a:fillRect/>
                     </a:stretch>
@@ -8501,18 +8549,18 @@
           <wp:inline>
             <wp:extent cx="5334000" cy="3467099"/>
             <wp:effectExtent b="0" l="0" r="0" t="0"/>
-            <wp:docPr descr="Figure 3. Land area within a 30/60/120/180-minute drive of any sampled practice." title="" id="34" name="Picture"/>
+            <wp:docPr descr="Figure 3. Land area within a 30/60/120/180-minute drive of any sampled practice." title="" id="37" name="Picture"/>
             <a:graphic>
               <a:graphicData uri="http://schemas.openxmlformats.org/drawingml/2006/picture">
                 <pic:pic>
                   <pic:nvPicPr>
-                    <pic:cNvPr descr="model_output/isochrones/figS7_ent_drivetime_coverage.png" id="35" name="Picture"/>
+                    <pic:cNvPr descr="model_output/isochrones/figS7_ent_drivetime_coverage.png" id="38" name="Picture"/>
                     <pic:cNvPicPr>
                       <a:picLocks noChangeArrowheads="1" noChangeAspect="1"/>
                     </pic:cNvPicPr>
                   </pic:nvPicPr>
                   <pic:blipFill>
-                    <a:blip r:embed="rId33"/>
+                    <a:blip r:embed="rId36"/>
                     <a:stretch>
                       <a:fillRect/>
                     </a:stretch>
@@ -8547,8 +8595,8 @@
         <w:t xml:space="preserve">Figure 3. Land area within a 30/60/120/180-minute drive of any sampled practice.</w:t>
       </w:r>
     </w:p>
-    <w:bookmarkEnd w:id="36"/>
-    <w:bookmarkStart w:id="43" w:name="supplementary-material"/>
+    <w:bookmarkEnd w:id="39"/>
+    <w:bookmarkStart w:id="46" w:name="supplementary-material"/>
     <w:p>
       <w:pPr>
         <w:pStyle w:val="Heading2"/>
@@ -8586,18 +8634,18 @@
           <wp:inline>
             <wp:extent cx="2613660" cy="2032846"/>
             <wp:effectExtent b="0" l="0" r="0" t="0"/>
-            <wp:docPr descr="Supplementary figures S1 (time-to-appointment) and S2 (wait distribution)." title="" id="38" name="Picture"/>
+            <wp:docPr descr="Supplementary figures S1 (time-to-appointment) and S2 (wait distribution)." title="" id="41" name="Picture"/>
             <a:graphic>
               <a:graphicData uri="http://schemas.openxmlformats.org/drawingml/2006/picture">
                 <pic:pic>
                   <pic:nvPicPr>
-                    <pic:cNvPr descr="model_output/supp/figS1_km_time_to_appointment.png" id="39" name="Picture"/>
+                    <pic:cNvPr descr="model_output/supp/figS1_km_time_to_appointment.png" id="42" name="Picture"/>
                     <pic:cNvPicPr>
                       <a:picLocks noChangeArrowheads="1" noChangeAspect="1"/>
                     </pic:cNvPicPr>
                   </pic:nvPicPr>
                   <pic:blipFill>
-                    <a:blip r:embed="rId37"/>
+                    <a:blip r:embed="rId40"/>
                     <a:stretch>
                       <a:fillRect/>
                     </a:stretch>
@@ -8628,18 +8676,18 @@
           <wp:inline>
             <wp:extent cx="2613660" cy="1633537"/>
             <wp:effectExtent b="0" l="0" r="0" t="0"/>
-            <wp:docPr descr="Supplementary figures S1 (time-to-appointment) and S2 (wait distribution)." title="" id="41" name="Picture"/>
+            <wp:docPr descr="Supplementary figures S1 (time-to-appointment) and S2 (wait distribution)." title="" id="44" name="Picture"/>
             <a:graphic>
               <a:graphicData uri="http://schemas.openxmlformats.org/drawingml/2006/picture">
                 <pic:pic>
                   <pic:nvPicPr>
-                    <pic:cNvPr descr="model_output/supp/figS2_wait_distribution.png" id="42" name="Picture"/>
+                    <pic:cNvPr descr="model_output/supp/figS2_wait_distribution.png" id="45" name="Picture"/>
                     <pic:cNvPicPr>
                       <a:picLocks noChangeArrowheads="1" noChangeAspect="1"/>
                     </pic:cNvPicPr>
                   </pic:nvPicPr>
                   <pic:blipFill>
-                    <a:blip r:embed="rId40"/>
+                    <a:blip r:embed="rId43"/>
                     <a:stretch>
                       <a:fillRect/>
                     </a:stretch>
@@ -8666,7 +8714,7 @@
         </w:drawing>
       </w:r>
     </w:p>
-    <w:bookmarkEnd w:id="43"/>
+    <w:bookmarkEnd w:id="46"/>
     <w:sectPr>
       <w:footnotePr>
         <w:numRestart w:val="eachSect"/>

</xml_diff>

<commit_message>
Full Methods + AMA (White Journal) bibliography; fix cut-off Figure 3
- manuscript.Rmd: full Methods text inline (Study design, Outcomes, Geographic
  covariates, Drive-time analysis, Statistical analysis) replacing the summary.
- Bibliography via BibTeX + AMA CSL (Otolaryngology-Head & Neck Surgery / 'White
  Journal' uses AMA style; no dedicated CSL exists). manuscript/references.bib
  (accurate R/glmmTMB/emmeans/STROBE/SVI/KFF/Valhalla entries + clinical
  placeholders) + american-medical-association.csl; in-text cites + numbered
  reference list render.
- isochrone_map.R: fix Figure 3 cut-off (coord_sf used a hardcoded ylim that
  clipped the northern half; now uses the data bbox) and move legend to bottom
  so labels aren't clipped. Regenerated full-CONUS map.
- Re-rendered manuscript (Word + HTML): 9 figures, all tables, AMA references.

Co-Authored-By: Claude Opus 4.8 (1M context) <noreply@anthropic.com>
</commit_message>
<xml_diff>
--- a/manuscript_output/manuscript.docx
+++ b/manuscript_output/manuscript.docx
@@ -162,13 +162,22 @@
       </w:r>
     </w:p>
     <w:bookmarkEnd w:id="21"/>
-    <w:bookmarkStart w:id="22" w:name="methods"/>
+    <w:bookmarkStart w:id="27" w:name="methods"/>
     <w:p>
       <w:pPr>
         <w:pStyle w:val="Heading2"/>
       </w:pPr>
       <w:r>
         <w:t xml:space="preserve">Methods</w:t>
+      </w:r>
+    </w:p>
+    <w:bookmarkStart w:id="22" w:name="study-design-and-sample"/>
+    <w:p>
+      <w:pPr>
+        <w:pStyle w:val="Heading3"/>
+      </w:pPr>
+      <w:r>
+        <w:t xml:space="preserve">Study design and sample</w:t>
       </w:r>
     </w:p>
     <w:p>
@@ -176,33 +185,61 @@
         <w:pStyle w:val="FirstParagraph"/>
       </w:pPr>
       <w:r>
+        <w:t xml:space="preserve">We conducted a cross-sectional, simulated-patient (</w:t>
+      </w:r>
+      <w:r>
+        <w:t xml:space="preserve">“mystery caller”</w:t>
+      </w:r>
+      <w:r>
+        <w:t xml:space="preserve">) study of access to otolaryngology (ENT) care in the United States. Trained callers telephoned a national sample of practicing, board-certified otolaryngologists and, following a standardized script, requested a new-patient appointment for a subspecialty-matched chief complaint. Each sampled physician was contacted once.</w:t>
+      </w:r>
+      <w:r>
+        <w:t xml:space="preserve"> </w:t>
+      </w:r>
+      <w:r>
         <w:rPr>
           <w:i/>
           <w:iCs/>
         </w:rPr>
-        <w:t xml:space="preserve">(Full Methods text is maintained in</w:t>
+        <w:t xml:space="preserve">[Describe the sampling frame and its size, the number and timing of call attempts before a call was recorded as unreachable, the scripted chief complaints, caller training, and the study period.]</w:t>
+      </w:r>
+      <w:r>
+        <w:t xml:space="preserve"> </w:t>
+      </w:r>
+      <w:r>
+        <w:t xml:space="preserve">The protocol was</w:t>
+      </w:r>
+      <w:r>
+        <w:t xml:space="preserve"> </w:t>
       </w:r>
       <w:r>
         <w:rPr>
           <w:i/>
           <w:iCs/>
         </w:rPr>
+        <w:t xml:space="preserve">[reviewed/deemed exempt]</w:t>
+      </w:r>
+      <w:r>
         <w:t xml:space="preserve"> </w:t>
       </w:r>
       <w:r>
-        <w:rPr>
-          <w:rStyle w:val="VerbatimChar"/>
-          <w:i/>
-          <w:iCs/>
-        </w:rPr>
-        <w:t xml:space="preserve">docs/manuscript_draft.md</w:t>
+        <w:t xml:space="preserve">by the</w:t>
+      </w:r>
+      <w:r>
+        <w:t xml:space="preserve"> </w:t>
       </w:r>
       <w:r>
         <w:rPr>
           <w:i/>
           <w:iCs/>
         </w:rPr>
-        <w:t xml:space="preserve">; the key elements are summarized here.)</w:t>
+        <w:t xml:space="preserve">[institution]</w:t>
+      </w:r>
+      <w:r>
+        <w:t xml:space="preserve"> </w:t>
+      </w:r>
+      <w:r>
+        <w:t xml:space="preserve">Institutional Review Board.</w:t>
       </w:r>
     </w:p>
     <w:p>
@@ -210,13 +247,51 @@
         <w:pStyle w:val="BodyText"/>
       </w:pPr>
       <w:r>
-        <w:t xml:space="preserve">We conducted a cross-sectional, simulated-patient (</w:t>
-      </w:r>
-      <w:r>
-        <w:t xml:space="preserve">“mystery caller”</w:t>
-      </w:r>
-      <w:r>
-        <w:t xml:space="preserve">) study of a national sample of board-certified otolaryngologists. Trained callers requested a new-patient appointment for a subspecialty-matched chief complaint; each physician was contacted once. Analyses were restricted to calls with a completed data-collection record and a determinable subspecialty. Two outcomes were modeled separately to avoid conditioning wait time on the offer:</w:t>
+        <w:t xml:space="preserve">Analyses were restricted to calls with a completed data-collection record and a determinable physician subspecialty. This study did not manipulate patient insurance; the exposures of interest were the requested subspecialty and the geographic context of the practice.</w:t>
+      </w:r>
+    </w:p>
+    <w:bookmarkEnd w:id="22"/>
+    <w:bookmarkStart w:id="23" w:name="outcomes"/>
+    <w:p>
+      <w:pPr>
+        <w:pStyle w:val="Heading3"/>
+      </w:pPr>
+      <w:r>
+        <w:t xml:space="preserve">Outcomes</w:t>
+      </w:r>
+    </w:p>
+    <w:p>
+      <w:pPr>
+        <w:pStyle w:val="FirstParagraph"/>
+      </w:pPr>
+      <w:r>
+        <w:t xml:space="preserve">Two outcomes were analyzed as a two-part (hurdle) process. The first,</w:t>
+      </w:r>
+      <w:r>
+        <w:t xml:space="preserve"> </w:t>
+      </w:r>
+      <w:r>
+        <w:rPr>
+          <w:i/>
+          <w:iCs/>
+        </w:rPr>
+        <w:t xml:space="preserve">access</w:t>
+      </w:r>
+      <w:r>
+        <w:t xml:space="preserve">, was whether the office offered a new-patient appointment with the sampled physician (binary). The second,</w:t>
+      </w:r>
+      <w:r>
+        <w:t xml:space="preserve"> </w:t>
+      </w:r>
+      <w:r>
+        <w:rPr>
+          <w:i/>
+          <w:iCs/>
+        </w:rPr>
+        <w:t xml:space="preserve">timeliness</w:t>
+      </w:r>
+      <w:r>
+        <w:t xml:space="preserve">, was the number of</w:t>
       </w:r>
       <w:r>
         <w:t xml:space="preserve"> </w:t>
@@ -226,21 +301,127 @@
           <w:b/>
           <w:bCs/>
         </w:rPr>
-        <w:t xml:space="preserve">access</w:t>
+        <w:t xml:space="preserve">business days</w:t>
       </w:r>
       <w:r>
         <w:t xml:space="preserve"> </w:t>
       </w:r>
       <w:r>
-        <w:t xml:space="preserve">(an appointment offered, logistic mixed model over all analytic calls) and</w:t>
+        <w:t xml:space="preserve">from the call to the next available appointment, counted excluding weekends and U.S. federal holidays, and defined only for calls in which an appointment was offered.</w:t>
+      </w:r>
+    </w:p>
+    <w:bookmarkEnd w:id="23"/>
+    <w:bookmarkStart w:id="24" w:name="geographic-covariates"/>
+    <w:p>
+      <w:pPr>
+        <w:pStyle w:val="Heading3"/>
+      </w:pPr>
+      <w:r>
+        <w:t xml:space="preserve">Geographic covariates</w:t>
+      </w:r>
+    </w:p>
+    <w:p>
+      <w:pPr>
+        <w:pStyle w:val="FirstParagraph"/>
+      </w:pPr>
+      <w:r>
+        <w:t xml:space="preserve">Each practice was linked to contextual covariates by practice ZIP code and state. County was assigned from a 2020 Census ZCTA-to-county crosswalk (dominant county by land area). Covariates comprised: county otolaryngologist supply per 100,000 population; the state Medicaid-to-Medicare fee index (Kaiser Family Foundation, 2024, all services)</w:t>
+      </w:r>
+      <w:hyperlink w:anchor="ref-kfffee">
+        <w:r>
+          <w:rPr>
+            <w:rStyle w:val="Hyperlink"/>
+            <w:vertAlign w:val="superscript"/>
+          </w:rPr>
+          <w:t xml:space="preserve">1</w:t>
+        </w:r>
+      </w:hyperlink>
+      <w:r>
+        <w:t xml:space="preserve">; the CDC/ATSDR Social Vulnerability Index (SVI, 2022, tract-level, population-weighted to the practice ZIP)</w:t>
+      </w:r>
+      <w:hyperlink w:anchor="ref-cdcsvi">
+        <w:r>
+          <w:rPr>
+            <w:rStyle w:val="Hyperlink"/>
+            <w:vertAlign w:val="superscript"/>
+          </w:rPr>
+          <w:t xml:space="preserve">2</w:t>
+        </w:r>
+      </w:hyperlink>
+      <w:r>
+        <w:t xml:space="preserve">; the county fraction of Medicare beneficiaries dual-eligible for Medicaid (CMS); metropolitan hospital-market concentration (Herfindahl–Hirschman Index [HHI], KFF 2024; available for metropolitan areas only); rurality (RUCA-based urban/suburban/rural); and the American Academy of Otolaryngology–Head and Neck Surgery (AAO-HNS) Board of Governors region.</w:t>
+      </w:r>
+    </w:p>
+    <w:bookmarkEnd w:id="24"/>
+    <w:bookmarkStart w:id="25" w:name="drive-time-isochrone-analysis"/>
+    <w:p>
+      <w:pPr>
+        <w:pStyle w:val="Heading3"/>
+      </w:pPr>
+      <w:r>
+        <w:t xml:space="preserve">Drive-time (isochrone) analysis</w:t>
+      </w:r>
+    </w:p>
+    <w:p>
+      <w:pPr>
+        <w:pStyle w:val="FirstParagraph"/>
+      </w:pPr>
+      <w:r>
+        <w:t xml:space="preserve">Geographic reach was assessed with drive-time isochrones. Each practice was geolocated to its ZIP-code centroid, and 30-, 60-, 120-, and 180-minute driving isochrones were computed with the Valhalla routing engine (automobile profile) served from a self-hosted instance</w:t>
+      </w:r>
+      <w:hyperlink w:anchor="ref-valhalla">
+        <w:r>
+          <w:rPr>
+            <w:rStyle w:val="Hyperlink"/>
+            <w:vertAlign w:val="superscript"/>
+          </w:rPr>
+          <w:t xml:space="preserve">3</w:t>
+        </w:r>
+      </w:hyperlink>
+      <w:r>
+        <w:t xml:space="preserve">. Isochrones from all practices were dissolved into a single coverage polygon per travel-time band, clipped to the continental United States, and the covered fraction of land area was computed in an equal-area projection.</w:t>
+      </w:r>
+    </w:p>
+    <w:bookmarkEnd w:id="25"/>
+    <w:bookmarkStart w:id="26" w:name="statistical-analysis"/>
+    <w:p>
+      <w:pPr>
+        <w:pStyle w:val="Heading3"/>
+      </w:pPr>
+      <w:r>
+        <w:t xml:space="preserve">Statistical analysis</w:t>
+      </w:r>
+    </w:p>
+    <w:p>
+      <w:pPr>
+        <w:pStyle w:val="FirstParagraph"/>
+      </w:pPr>
+      <w:r>
+        <w:t xml:space="preserve">Because business-day wait time is observed only when an appointment is offered, we modeled access and timeliness separately to avoid conditioning wait-time estimates on the offer.</w:t>
       </w:r>
       <w:r>
         <w:t xml:space="preserve"> </w:t>
       </w:r>
       <w:r>
         <w:rPr>
-          <w:b/>
-          <w:bCs/>
+          <w:i/>
+          <w:iCs/>
+        </w:rPr>
+        <w:t xml:space="preserve">Access</w:t>
+      </w:r>
+      <w:r>
+        <w:t xml:space="preserve"> </w:t>
+      </w:r>
+      <w:r>
+        <w:t xml:space="preserve">was modeled with a mixed-effects logistic regression over all analytic calls;</w:t>
+      </w:r>
+      <w:r>
+        <w:t xml:space="preserve"> </w:t>
+      </w:r>
+      <w:r>
+        <w:rPr>
+          <w:i/>
+          <w:iCs/>
         </w:rPr>
         <w:t xml:space="preserve">timeliness</w:t>
       </w:r>
@@ -248,7 +429,42 @@
         <w:t xml:space="preserve"> </w:t>
       </w:r>
       <w:r>
-        <w:t xml:space="preserve">(business days to the next available appointment, negative binomial mixed model over the offered subset; the negative binomial was selected over Poisson given substantial overdispersion). Both models adjusted for requested subspecialty (reference: general otolaryngology), county ENT supply per 100,000, the state Medicaid-to-Medicare fee index, the CDC/ATSDR Social Vulnerability Index, county dual-eligible fraction, and rurality (reference: urban), with a random intercept for core-based statistical area and a fixed adjustment for caller. Drive-time isochrones (30/60/120/180 minutes) were computed for each practice with the Valhalla routing engine and dissolved into national coverage polygons. Analyses used R (packages</w:t>
+        <w:t xml:space="preserve">with a mixed-effects negative binomial regression over the offered subset. The negative binomial distribution was selected over Poisson on the basis of substantial overdispersion (Pearson φ = 6.22). Both models included a random intercept for core-based statistical area (CBSA; county FIPS where CBSA was undefined) to account for within-market correlation, and adjusted for the requested subspecialty (reference: general otolaryngology), county ENT supply, Medicaid fee index, SVI, dual-eligible fraction, and rurality (reference: urban). The identity of the caller (research assistant) was included as a fixed nuisance term. Continuous covariates were standardized and, for the few missing values (&lt;3%), median-imputed.</w:t>
+      </w:r>
+    </w:p>
+    <w:p>
+      <w:pPr>
+        <w:pStyle w:val="BodyText"/>
+      </w:pPr>
+      <w:r>
+        <w:t xml:space="preserve">Effects are reported as odds ratios (access) and incidence rate ratios (timeliness) with 95% Wald confidence intervals. Pairwise differences between subspecialties were estimated with Tukey-adjusted estimated marginal means</w:t>
+      </w:r>
+      <w:hyperlink w:anchor="ref-emmeans">
+        <w:r>
+          <w:rPr>
+            <w:rStyle w:val="Hyperlink"/>
+            <w:vertAlign w:val="superscript"/>
+          </w:rPr>
+          <w:t xml:space="preserve">4</w:t>
+        </w:r>
+      </w:hyperlink>
+      <w:r>
+        <w:t xml:space="preserve">. Effect modification of the geographic covariates by subspecialty was tested by likelihood-ratio tests. Market-level clustering was summarized by the intraclass correlation coefficient (ICC). Because the HHI is defined only in metropolitan areas, its association with timeliness was assessed in a sensitivity model restricted to the metropolitan subset. Whether call incompleteness was related to the measured covariates was assessed with chi-square and Wilcoxon rank-sum tests. Analyses used R 4.4.2</w:t>
+      </w:r>
+      <w:hyperlink w:anchor="ref-rcoreteam">
+        <w:r>
+          <w:rPr>
+            <w:rStyle w:val="Hyperlink"/>
+            <w:vertAlign w:val="superscript"/>
+          </w:rPr>
+          <w:t xml:space="preserve">5</w:t>
+        </w:r>
+      </w:hyperlink>
+      <w:r>
+        <w:t xml:space="preserve"> </w:t>
+      </w:r>
+      <w:r>
+        <w:t xml:space="preserve">(packages</w:t>
       </w:r>
       <w:r>
         <w:t xml:space="preserve"> </w:t>
@@ -259,6 +475,15 @@
         </w:rPr>
         <w:t xml:space="preserve">glmmTMB</w:t>
       </w:r>
+      <w:hyperlink w:anchor="ref-glmmTMB">
+        <w:r>
+          <w:rPr>
+            <w:rStyle w:val="Hyperlink"/>
+            <w:vertAlign w:val="superscript"/>
+          </w:rPr>
+          <w:t xml:space="preserve">6</w:t>
+        </w:r>
+      </w:hyperlink>
       <w:r>
         <w:t xml:space="preserve">,</w:t>
       </w:r>
@@ -271,12 +496,46 @@
         </w:rPr>
         <w:t xml:space="preserve">emmeans</w:t>
       </w:r>
-      <w:r>
-        <w:t xml:space="preserve">); α = 0.05, two-sided.</w:t>
+      <w:hyperlink w:anchor="ref-emmeans">
+        <w:r>
+          <w:rPr>
+            <w:rStyle w:val="Hyperlink"/>
+            <w:vertAlign w:val="superscript"/>
+          </w:rPr>
+          <w:t xml:space="preserve">4</w:t>
+        </w:r>
+      </w:hyperlink>
+      <w:r>
+        <w:t xml:space="preserve">, and the study package</w:t>
+      </w:r>
+      <w:r>
+        <w:t xml:space="preserve"> </w:t>
+      </w:r>
+      <w:r>
+        <w:rPr>
+          <w:rStyle w:val="VerbatimChar"/>
+        </w:rPr>
+        <w:t xml:space="preserve">mysterycall</w:t>
+      </w:r>
+      <w:r>
+        <w:t xml:space="preserve">); two-sided α = 0.05. Reporting follows the STROBE guideline for observational studies</w:t>
+      </w:r>
+      <w:hyperlink w:anchor="ref-strobe">
+        <w:r>
+          <w:rPr>
+            <w:rStyle w:val="Hyperlink"/>
+            <w:vertAlign w:val="superscript"/>
+          </w:rPr>
+          <w:t xml:space="preserve">7</w:t>
+        </w:r>
+      </w:hyperlink>
+      <w:r>
+        <w:t xml:space="preserve">.</w:t>
       </w:r>
     </w:p>
-    <w:bookmarkEnd w:id="22"/>
-    <w:bookmarkStart w:id="28" w:name="results"/>
+    <w:bookmarkEnd w:id="26"/>
+    <w:bookmarkEnd w:id="27"/>
+    <w:bookmarkStart w:id="33" w:name="results"/>
     <w:p>
       <w:pPr>
         <w:pStyle w:val="Heading2"/>
@@ -285,7 +544,7 @@
         <w:t xml:space="preserve">Results</w:t>
       </w:r>
     </w:p>
-    <w:bookmarkStart w:id="23" w:name="sample-and-attrition"/>
+    <w:bookmarkStart w:id="28" w:name="sample-and-attrition"/>
     <w:p>
       <w:pPr>
         <w:pStyle w:val="Heading3"/>
@@ -3409,8 +3668,8 @@
         </w:tc>
       </w:tr>
     </w:tbl>
-    <w:bookmarkEnd w:id="23"/>
-    <w:bookmarkStart w:id="24" w:name="access-to-appointments"/>
+    <w:bookmarkEnd w:id="28"/>
+    <w:bookmarkStart w:id="29" w:name="access-to-appointments"/>
     <w:p>
       <w:pPr>
         <w:pStyle w:val="Heading3"/>
@@ -3437,8 +3696,8 @@
         <w:t xml:space="preserve">).</w:t>
       </w:r>
     </w:p>
-    <w:bookmarkEnd w:id="24"/>
-    <w:bookmarkStart w:id="25" w:name="timeliness-of-appointments"/>
+    <w:bookmarkEnd w:id="29"/>
+    <w:bookmarkStart w:id="30" w:name="timeliness-of-appointments"/>
     <w:p>
       <w:pPr>
         <w:pStyle w:val="Heading3"/>
@@ -8216,8 +8475,8 @@
         </w:tc>
       </w:tr>
     </w:tbl>
-    <w:bookmarkEnd w:id="25"/>
-    <w:bookmarkStart w:id="26" w:name="geographic-reach-drive-time-access"/>
+    <w:bookmarkEnd w:id="30"/>
+    <w:bookmarkStart w:id="31" w:name="geographic-reach-drive-time-access"/>
     <w:p>
       <w:pPr>
         <w:pStyle w:val="Heading3"/>
@@ -8244,8 +8503,8 @@
         <w:t xml:space="preserve">). Roughly one-fifth of the country is more than a 3-hour drive from any sampled otolaryngologist, concentrated in the Mountain West, Great Plains, and desert Southwest.</w:t>
       </w:r>
     </w:p>
-    <w:bookmarkEnd w:id="26"/>
-    <w:bookmarkStart w:id="27" w:name="robustness-and-missing-data"/>
+    <w:bookmarkEnd w:id="31"/>
+    <w:bookmarkStart w:id="32" w:name="robustness-and-missing-data"/>
     <w:p>
       <w:pPr>
         <w:pStyle w:val="Heading3"/>
@@ -8262,9 +8521,9 @@
         <w:t xml:space="preserve">Under Tukey-adjusted pairwise comparison no subspecialty pair reached significance, and the subspecialty effect did not vary by rurality or supply (interaction likelihood-ratio tests, both non-significant). In a metropolitan sensitivity model, greater hospital-market concentration was associated with a borderline increase in wait time (HHI IRR 1.20 per SD; p = 0.058). Call incompleteness was unrelated to practice geography, supporting a missing-at-random mechanism with respect to location (Supplement).</w:t>
       </w:r>
     </w:p>
-    <w:bookmarkEnd w:id="27"/>
-    <w:bookmarkEnd w:id="28"/>
-    <w:bookmarkStart w:id="29" w:name="discussion"/>
+    <w:bookmarkEnd w:id="32"/>
+    <w:bookmarkEnd w:id="33"/>
+    <w:bookmarkStart w:id="34" w:name="discussion"/>
     <w:p>
       <w:pPr>
         <w:pStyle w:val="Heading2"/>
@@ -8352,8 +8611,8 @@
         <w:t xml:space="preserve">gap — roughly a fifth of the U.S. land area is beyond a 3-hour drive of any sampled practice — indicating that the access problem is one of absolute absence in large regions rather than gradients in supply where practices exist. Limitations include modest power for the rural and geographic contrasts, a single call per physician, and ZIP-centroid geolocation for the drive-time analysis.</w:t>
       </w:r>
     </w:p>
-    <w:bookmarkEnd w:id="29"/>
-    <w:bookmarkStart w:id="39" w:name="figures"/>
+    <w:bookmarkEnd w:id="34"/>
+    <w:bookmarkStart w:id="44" w:name="figures"/>
     <w:p>
       <w:pPr>
         <w:pStyle w:val="Heading2"/>
@@ -8415,18 +8674,18 @@
           <wp:inline>
             <wp:extent cx="5334000" cy="6519333"/>
             <wp:effectExtent b="0" l="0" r="0" t="0"/>
-            <wp:docPr descr="Figure 1. Participant flow from calls placed to the two analytic samples." title="" id="31" name="Picture"/>
+            <wp:docPr descr="Figure 1. Participant flow from calls placed to the two analytic samples." title="" id="36" name="Picture"/>
             <a:graphic>
               <a:graphicData uri="http://schemas.openxmlformats.org/drawingml/2006/picture">
                 <pic:pic>
                   <pic:nvPicPr>
-                    <pic:cNvPr descr="model_output/strobe_flow_mysterycall.png" id="32" name="Picture"/>
+                    <pic:cNvPr descr="model_output/strobe_flow_mysterycall.png" id="37" name="Picture"/>
                     <pic:cNvPicPr>
                       <a:picLocks noChangeArrowheads="1" noChangeAspect="1"/>
                     </pic:cNvPicPr>
                   </pic:nvPicPr>
                   <pic:blipFill>
-                    <a:blip r:embed="rId30"/>
+                    <a:blip r:embed="rId35"/>
                     <a:stretch>
                       <a:fillRect/>
                     </a:stretch>
@@ -8482,18 +8741,18 @@
           <wp:inline>
             <wp:extent cx="5334000" cy="3200400"/>
             <wp:effectExtent b="0" l="0" r="0" t="0"/>
-            <wp:docPr descr="Figure 2. Adjusted access and timeliness effects." title="" id="34" name="Picture"/>
+            <wp:docPr descr="Figure 2. Adjusted access and timeliness effects." title="" id="39" name="Picture"/>
             <a:graphic>
               <a:graphicData uri="http://schemas.openxmlformats.org/drawingml/2006/picture">
                 <pic:pic>
                   <pic:nvPicPr>
-                    <pic:cNvPr descr="model_output/forest_access_timeliness.png" id="35" name="Picture"/>
+                    <pic:cNvPr descr="model_output/forest_access_timeliness.png" id="40" name="Picture"/>
                     <pic:cNvPicPr>
                       <a:picLocks noChangeArrowheads="1" noChangeAspect="1"/>
                     </pic:cNvPicPr>
                   </pic:nvPicPr>
                   <pic:blipFill>
-                    <a:blip r:embed="rId33"/>
+                    <a:blip r:embed="rId38"/>
                     <a:stretch>
                       <a:fillRect/>
                     </a:stretch>
@@ -8547,20 +8806,20 @@
       <w:r>
         <w:drawing>
           <wp:inline>
-            <wp:extent cx="5334000" cy="3467099"/>
+            <wp:extent cx="5334000" cy="3911600"/>
             <wp:effectExtent b="0" l="0" r="0" t="0"/>
-            <wp:docPr descr="Figure 3. Land area within a 30/60/120/180-minute drive of any sampled practice." title="" id="37" name="Picture"/>
+            <wp:docPr descr="Figure 3. Land area within a 30/60/120/180-minute drive of any sampled practice." title="" id="42" name="Picture"/>
             <a:graphic>
               <a:graphicData uri="http://schemas.openxmlformats.org/drawingml/2006/picture">
                 <pic:pic>
                   <pic:nvPicPr>
-                    <pic:cNvPr descr="model_output/isochrones/figS7_ent_drivetime_coverage.png" id="38" name="Picture"/>
+                    <pic:cNvPr descr="model_output/isochrones/figS7_ent_drivetime_coverage.png" id="43" name="Picture"/>
                     <pic:cNvPicPr>
                       <a:picLocks noChangeArrowheads="1" noChangeAspect="1"/>
                     </pic:cNvPicPr>
                   </pic:nvPicPr>
                   <pic:blipFill>
-                    <a:blip r:embed="rId36"/>
+                    <a:blip r:embed="rId41"/>
                     <a:stretch>
                       <a:fillRect/>
                     </a:stretch>
@@ -8568,7 +8827,7 @@
                   <pic:spPr bwMode="auto">
                     <a:xfrm>
                       <a:off x="0" y="0"/>
-                      <a:ext cx="5334000" cy="3467099"/>
+                      <a:ext cx="5334000" cy="3911600"/>
                     </a:xfrm>
                     <a:prstGeom prst="rect">
                       <a:avLst/>
@@ -8600,8 +8859,8 @@
         <w:br w:type="page"/>
       </w:r>
     </w:p>
-    <w:bookmarkEnd w:id="39"/>
-    <w:bookmarkStart w:id="60" w:name="supplementary-material"/>
+    <w:bookmarkEnd w:id="44"/>
+    <w:bookmarkStart w:id="65" w:name="supplementary-material"/>
     <w:p>
       <w:pPr>
         <w:pStyle w:val="Heading1"/>
@@ -8610,7 +8869,7 @@
         <w:t xml:space="preserve">Supplementary Material</w:t>
       </w:r>
     </w:p>
-    <w:bookmarkStart w:id="40" w:name="supplementary-tables"/>
+    <w:bookmarkStart w:id="45" w:name="supplementary-tables"/>
     <w:p>
       <w:pPr>
         <w:pStyle w:val="Heading2"/>
@@ -16655,8 +16914,8 @@
         </w:tc>
       </w:tr>
     </w:tbl>
-    <w:bookmarkEnd w:id="40"/>
-    <w:bookmarkStart w:id="59" w:name="supplementary-figures"/>
+    <w:bookmarkEnd w:id="45"/>
+    <w:bookmarkStart w:id="64" w:name="supplementary-figures"/>
     <w:p>
       <w:pPr>
         <w:pStyle w:val="Heading2"/>
@@ -16686,18 +16945,18 @@
           <wp:inline>
             <wp:extent cx="5334000" cy="4148666"/>
             <wp:effectExtent b="0" l="0" r="0" t="0"/>
-            <wp:docPr descr="" title="" id="42" name="Picture"/>
+            <wp:docPr descr="" title="" id="47" name="Picture"/>
             <a:graphic>
               <a:graphicData uri="http://schemas.openxmlformats.org/drawingml/2006/picture">
                 <pic:pic>
                   <pic:nvPicPr>
-                    <pic:cNvPr descr="model_output/supp/figS1_km_time_to_appointment.png" id="43" name="Picture"/>
+                    <pic:cNvPr descr="model_output/supp/figS1_km_time_to_appointment.png" id="48" name="Picture"/>
                     <pic:cNvPicPr>
                       <a:picLocks noChangeArrowheads="1" noChangeAspect="1"/>
                     </pic:cNvPicPr>
                   </pic:nvPicPr>
                   <pic:blipFill>
-                    <a:blip r:embed="rId41"/>
+                    <a:blip r:embed="rId46"/>
                     <a:stretch>
                       <a:fillRect/>
                     </a:stretch>
@@ -16745,18 +17004,18 @@
           <wp:inline>
             <wp:extent cx="5334000" cy="3333750"/>
             <wp:effectExtent b="0" l="0" r="0" t="0"/>
-            <wp:docPr descr="" title="" id="45" name="Picture"/>
+            <wp:docPr descr="" title="" id="50" name="Picture"/>
             <a:graphic>
               <a:graphicData uri="http://schemas.openxmlformats.org/drawingml/2006/picture">
                 <pic:pic>
                   <pic:nvPicPr>
-                    <pic:cNvPr descr="model_output/supp/figS2_wait_distribution.png" id="46" name="Picture"/>
+                    <pic:cNvPr descr="model_output/supp/figS2_wait_distribution.png" id="51" name="Picture"/>
                     <pic:cNvPicPr>
                       <a:picLocks noChangeArrowheads="1" noChangeAspect="1"/>
                     </pic:cNvPicPr>
                   </pic:nvPicPr>
                   <pic:blipFill>
-                    <a:blip r:embed="rId44"/>
+                    <a:blip r:embed="rId49"/>
                     <a:stretch>
                       <a:fillRect/>
                     </a:stretch>
@@ -16804,18 +17063,18 @@
           <wp:inline>
             <wp:extent cx="5334000" cy="2667000"/>
             <wp:effectExtent b="0" l="0" r="0" t="0"/>
-            <wp:docPr descr="" title="" id="48" name="Picture"/>
+            <wp:docPr descr="" title="" id="53" name="Picture"/>
             <a:graphic>
               <a:graphicData uri="http://schemas.openxmlformats.org/drawingml/2006/picture">
                 <pic:pic>
                   <pic:nvPicPr>
-                    <pic:cNvPr descr="model_output/supp/figS3_nb_diagnostics.png" id="49" name="Picture"/>
+                    <pic:cNvPr descr="model_output/supp/figS3_nb_diagnostics.png" id="54" name="Picture"/>
                     <pic:cNvPicPr>
                       <a:picLocks noChangeArrowheads="1" noChangeAspect="1"/>
                     </pic:cNvPicPr>
                   </pic:nvPicPr>
                   <pic:blipFill>
-                    <a:blip r:embed="rId47"/>
+                    <a:blip r:embed="rId52"/>
                     <a:stretch>
                       <a:fillRect/>
                     </a:stretch>
@@ -16863,18 +17122,18 @@
           <wp:inline>
             <wp:extent cx="5334000" cy="3333750"/>
             <wp:effectExtent b="0" l="0" r="0" t="0"/>
-            <wp:docPr descr="" title="" id="51" name="Picture"/>
+            <wp:docPr descr="" title="" id="56" name="Picture"/>
             <a:graphic>
               <a:graphicData uri="http://schemas.openxmlformats.org/drawingml/2006/picture">
                 <pic:pic>
                   <pic:nvPicPr>
-                    <pic:cNvPr descr="model_output/supp/figS4_choropleth_offer_rate.png" id="52" name="Picture"/>
+                    <pic:cNvPr descr="model_output/supp/figS4_choropleth_offer_rate.png" id="57" name="Picture"/>
                     <pic:cNvPicPr>
                       <a:picLocks noChangeArrowheads="1" noChangeAspect="1"/>
                     </pic:cNvPicPr>
                   </pic:nvPicPr>
                   <pic:blipFill>
-                    <a:blip r:embed="rId50"/>
+                    <a:blip r:embed="rId55"/>
                     <a:stretch>
                       <a:fillRect/>
                     </a:stretch>
@@ -16922,18 +17181,18 @@
           <wp:inline>
             <wp:extent cx="5334000" cy="3333750"/>
             <wp:effectExtent b="0" l="0" r="0" t="0"/>
-            <wp:docPr descr="" title="" id="54" name="Picture"/>
+            <wp:docPr descr="" title="" id="59" name="Picture"/>
             <a:graphic>
               <a:graphicData uri="http://schemas.openxmlformats.org/drawingml/2006/picture">
                 <pic:pic>
                   <pic:nvPicPr>
-                    <pic:cNvPr descr="model_output/supp/figS4_choropleth_median_wait.png" id="55" name="Picture"/>
+                    <pic:cNvPr descr="model_output/supp/figS4_choropleth_median_wait.png" id="60" name="Picture"/>
                     <pic:cNvPicPr>
                       <a:picLocks noChangeArrowheads="1" noChangeAspect="1"/>
                     </pic:cNvPicPr>
                   </pic:nvPicPr>
                   <pic:blipFill>
-                    <a:blip r:embed="rId53"/>
+                    <a:blip r:embed="rId58"/>
                     <a:stretch>
                       <a:fillRect/>
                     </a:stretch>
@@ -16981,18 +17240,18 @@
           <wp:inline>
             <wp:extent cx="5334000" cy="3556000"/>
             <wp:effectExtent b="0" l="0" r="0" t="0"/>
-            <wp:docPr descr="" title="" id="57" name="Picture"/>
+            <wp:docPr descr="" title="" id="62" name="Picture"/>
             <a:graphic>
               <a:graphicData uri="http://schemas.openxmlformats.org/drawingml/2006/picture">
                 <pic:pic>
                   <pic:nvPicPr>
-                    <pic:cNvPr descr="model_output/supp/figS4b_offer_rate_by_state.png" id="58" name="Picture"/>
+                    <pic:cNvPr descr="model_output/supp/figS4b_offer_rate_by_state.png" id="63" name="Picture"/>
                     <pic:cNvPicPr>
                       <a:picLocks noChangeArrowheads="1" noChangeAspect="1"/>
                     </pic:cNvPicPr>
                   </pic:nvPicPr>
                   <pic:blipFill>
-                    <a:blip r:embed="rId56"/>
+                    <a:blip r:embed="rId61"/>
                     <a:stretch>
                       <a:fillRect/>
                     </a:stretch>
@@ -17053,8 +17312,341 @@
         <w:t xml:space="preserve">.</w:t>
       </w:r>
     </w:p>
-    <w:bookmarkEnd w:id="59"/>
-    <w:bookmarkEnd w:id="60"/>
+    <w:p>
+      <w:r>
+        <w:br w:type="page"/>
+      </w:r>
+    </w:p>
+    <w:bookmarkEnd w:id="64"/>
+    <w:bookmarkEnd w:id="65"/>
+    <w:bookmarkStart w:id="78" w:name="references"/>
+    <w:p>
+      <w:pPr>
+        <w:pStyle w:val="Heading1"/>
+      </w:pPr>
+      <w:r>
+        <w:t xml:space="preserve">References</w:t>
+      </w:r>
+    </w:p>
+    <w:bookmarkStart w:id="77" w:name="refs"/>
+    <w:bookmarkStart w:id="66" w:name="ref-kfffee"/>
+    <w:p>
+      <w:pPr>
+        <w:pStyle w:val="Bibliography"/>
+      </w:pPr>
+      <w:r>
+        <w:t xml:space="preserve">1.</w:t>
+      </w:r>
+      <w:r>
+        <w:t xml:space="preserve"> </w:t>
+      </w:r>
+      <w:r>
+        <w:t xml:space="preserve">	</w:t>
+      </w:r>
+      <w:r>
+        <w:t xml:space="preserve">Kaiser Family Foundation. Medicaid-to-medicare fee index. Published online 2024.</w:t>
+      </w:r>
+    </w:p>
+    <w:bookmarkEnd w:id="66"/>
+    <w:bookmarkStart w:id="67" w:name="ref-cdcsvi"/>
+    <w:p>
+      <w:pPr>
+        <w:pStyle w:val="Bibliography"/>
+      </w:pPr>
+      <w:r>
+        <w:t xml:space="preserve">2.</w:t>
+      </w:r>
+      <w:r>
+        <w:t xml:space="preserve"> </w:t>
+      </w:r>
+      <w:r>
+        <w:t xml:space="preserve">	</w:t>
+      </w:r>
+      <w:r>
+        <w:t xml:space="preserve">Agency for Toxic Substances and Disease Registry.</w:t>
+      </w:r>
+      <w:r>
+        <w:t xml:space="preserve"> </w:t>
+      </w:r>
+      <w:r>
+        <w:t xml:space="preserve">CDC/ATSDR</w:t>
+      </w:r>
+      <w:r>
+        <w:t xml:space="preserve"> </w:t>
+      </w:r>
+      <w:r>
+        <w:t xml:space="preserve">social vulnerability index (2022 database). Published online 2022.</w:t>
+      </w:r>
+    </w:p>
+    <w:bookmarkEnd w:id="67"/>
+    <w:bookmarkStart w:id="68" w:name="ref-valhalla"/>
+    <w:p>
+      <w:pPr>
+        <w:pStyle w:val="Bibliography"/>
+      </w:pPr>
+      <w:r>
+        <w:t xml:space="preserve">3.</w:t>
+      </w:r>
+      <w:r>
+        <w:t xml:space="preserve"> </w:t>
+      </w:r>
+      <w:r>
+        <w:t xml:space="preserve">	</w:t>
+      </w:r>
+      <w:r>
+        <w:t xml:space="preserve">Valhalla Contributors. Valhalla: Open-source routing engine for</w:t>
+      </w:r>
+      <w:r>
+        <w:t xml:space="preserve"> </w:t>
+      </w:r>
+      <w:r>
+        <w:t xml:space="preserve">OpenStreetMap</w:t>
+      </w:r>
+      <w:r>
+        <w:t xml:space="preserve">. Published online 2024.</w:t>
+      </w:r>
+    </w:p>
+    <w:bookmarkEnd w:id="68"/>
+    <w:bookmarkStart w:id="70" w:name="ref-emmeans"/>
+    <w:p>
+      <w:pPr>
+        <w:pStyle w:val="Bibliography"/>
+      </w:pPr>
+      <w:r>
+        <w:t xml:space="preserve">4.</w:t>
+      </w:r>
+      <w:r>
+        <w:t xml:space="preserve"> </w:t>
+      </w:r>
+      <w:r>
+        <w:t xml:space="preserve">	</w:t>
+      </w:r>
+      <w:r>
+        <w:t xml:space="preserve">Russell V. Lenth.</w:t>
+      </w:r>
+      <w:r>
+        <w:t xml:space="preserve"> </w:t>
+      </w:r>
+      <w:r>
+        <w:rPr>
+          <w:i/>
+          <w:iCs/>
+        </w:rPr>
+        <w:t xml:space="preserve">Emmeans: Estimated Marginal Means, Aka Least-Squares Means</w:t>
+      </w:r>
+      <w:r>
+        <w:t xml:space="preserve">. 2024.</w:t>
+      </w:r>
+      <w:r>
+        <w:t xml:space="preserve"> </w:t>
+      </w:r>
+      <w:hyperlink r:id="rId69">
+        <w:r>
+          <w:rPr>
+            <w:rStyle w:val="Hyperlink"/>
+          </w:rPr>
+          <w:t xml:space="preserve">https://CRAN.R-project.org/package=emmeans</w:t>
+        </w:r>
+      </w:hyperlink>
+    </w:p>
+    <w:bookmarkEnd w:id="70"/>
+    <w:bookmarkStart w:id="72" w:name="ref-rcoreteam"/>
+    <w:p>
+      <w:pPr>
+        <w:pStyle w:val="Bibliography"/>
+      </w:pPr>
+      <w:r>
+        <w:t xml:space="preserve">5.</w:t>
+      </w:r>
+      <w:r>
+        <w:t xml:space="preserve"> </w:t>
+      </w:r>
+      <w:r>
+        <w:t xml:space="preserve">	</w:t>
+      </w:r>
+      <w:r>
+        <w:t xml:space="preserve">R Core Team.</w:t>
+      </w:r>
+      <w:r>
+        <w:t xml:space="preserve"> </w:t>
+      </w:r>
+      <w:r>
+        <w:rPr>
+          <w:i/>
+          <w:iCs/>
+        </w:rPr>
+        <w:t xml:space="preserve">R: A Language and Environment for Statistical Computing</w:t>
+      </w:r>
+      <w:r>
+        <w:t xml:space="preserve">. R Foundation for Statistical Computing; 2024.</w:t>
+      </w:r>
+      <w:r>
+        <w:t xml:space="preserve"> </w:t>
+      </w:r>
+      <w:hyperlink r:id="rId71">
+        <w:r>
+          <w:rPr>
+            <w:rStyle w:val="Hyperlink"/>
+          </w:rPr>
+          <w:t xml:space="preserve">https://www.R-project.org/</w:t>
+        </w:r>
+      </w:hyperlink>
+    </w:p>
+    <w:bookmarkEnd w:id="72"/>
+    <w:bookmarkStart w:id="74" w:name="ref-glmmTMB"/>
+    <w:p>
+      <w:pPr>
+        <w:pStyle w:val="Bibliography"/>
+      </w:pPr>
+      <w:r>
+        <w:t xml:space="preserve">6.</w:t>
+      </w:r>
+      <w:r>
+        <w:t xml:space="preserve"> </w:t>
+      </w:r>
+      <w:r>
+        <w:t xml:space="preserve">	</w:t>
+      </w:r>
+      <w:r>
+        <w:t xml:space="preserve">Mollie E. Brooks, Kasper Kristensen, Koen J. van Benthem, Arni Magnusson, Casper W. Berg, Anders Nielsen, Hans J. Skaug, Martin Maechler, Benjamin M. Bolker.</w:t>
+      </w:r>
+      <w:r>
+        <w:t xml:space="preserve"> </w:t>
+      </w:r>
+      <w:r>
+        <w:t xml:space="preserve">glmmTMB</w:t>
+      </w:r>
+      <w:r>
+        <w:t xml:space="preserve"> </w:t>
+      </w:r>
+      <w:r>
+        <w:t xml:space="preserve">balances speed and flexibility among packages for zero-inflated generalized linear mixed models.</w:t>
+      </w:r>
+      <w:r>
+        <w:t xml:space="preserve"> </w:t>
+      </w:r>
+      <w:r>
+        <w:rPr>
+          <w:i/>
+          <w:iCs/>
+        </w:rPr>
+        <w:t xml:space="preserve">The R Journal</w:t>
+      </w:r>
+      <w:r>
+        <w:t xml:space="preserve">. 2017;9(2):378-400. doi:</w:t>
+      </w:r>
+      <w:hyperlink r:id="rId73">
+        <w:r>
+          <w:rPr>
+            <w:rStyle w:val="Hyperlink"/>
+          </w:rPr>
+          <w:t xml:space="preserve">10.32614/RJ-2017-066</w:t>
+        </w:r>
+      </w:hyperlink>
+    </w:p>
+    <w:bookmarkEnd w:id="74"/>
+    <w:bookmarkStart w:id="76" w:name="ref-strobe"/>
+    <w:p>
+      <w:pPr>
+        <w:pStyle w:val="Bibliography"/>
+      </w:pPr>
+      <w:r>
+        <w:t xml:space="preserve">7.</w:t>
+      </w:r>
+      <w:r>
+        <w:t xml:space="preserve"> </w:t>
+      </w:r>
+      <w:r>
+        <w:t xml:space="preserve">	</w:t>
+      </w:r>
+      <w:r>
+        <w:t xml:space="preserve">Erik von Elm, Douglas G. Altman, Matthias Egger, Stuart J. Pocock, Peter C. Gøtzsche, Jan P. Vandenbroucke. The</w:t>
+      </w:r>
+      <w:r>
+        <w:t xml:space="preserve"> </w:t>
+      </w:r>
+      <w:r>
+        <w:t xml:space="preserve">Strengthening</w:t>
+      </w:r>
+      <w:r>
+        <w:t xml:space="preserve"> </w:t>
+      </w:r>
+      <w:r>
+        <w:t xml:space="preserve">the</w:t>
+      </w:r>
+      <w:r>
+        <w:t xml:space="preserve"> </w:t>
+      </w:r>
+      <w:r>
+        <w:t xml:space="preserve">Reporting</w:t>
+      </w:r>
+      <w:r>
+        <w:t xml:space="preserve"> </w:t>
+      </w:r>
+      <w:r>
+        <w:t xml:space="preserve">of</w:t>
+      </w:r>
+      <w:r>
+        <w:t xml:space="preserve"> </w:t>
+      </w:r>
+      <w:r>
+        <w:t xml:space="preserve">Observational</w:t>
+      </w:r>
+      <w:r>
+        <w:t xml:space="preserve"> </w:t>
+      </w:r>
+      <w:r>
+        <w:t xml:space="preserve">Studies</w:t>
+      </w:r>
+      <w:r>
+        <w:t xml:space="preserve"> </w:t>
+      </w:r>
+      <w:r>
+        <w:t xml:space="preserve">in</w:t>
+      </w:r>
+      <w:r>
+        <w:t xml:space="preserve"> </w:t>
+      </w:r>
+      <w:r>
+        <w:t xml:space="preserve">Epidemiology</w:t>
+      </w:r>
+      <w:r>
+        <w:t xml:space="preserve"> </w:t>
+      </w:r>
+      <w:r>
+        <w:t xml:space="preserve">(</w:t>
+      </w:r>
+      <w:r>
+        <w:t xml:space="preserve">STROBE</w:t>
+      </w:r>
+      <w:r>
+        <w:t xml:space="preserve">) statement: Guidelines for reporting observational studies.</w:t>
+      </w:r>
+      <w:r>
+        <w:t xml:space="preserve"> </w:t>
+      </w:r>
+      <w:r>
+        <w:rPr>
+          <w:i/>
+          <w:iCs/>
+        </w:rPr>
+        <w:t xml:space="preserve">Annals of Internal Medicine</w:t>
+      </w:r>
+      <w:r>
+        <w:t xml:space="preserve">. 2007;147(8):573-577. doi:</w:t>
+      </w:r>
+      <w:hyperlink r:id="rId75">
+        <w:r>
+          <w:rPr>
+            <w:rStyle w:val="Hyperlink"/>
+          </w:rPr>
+          <w:t xml:space="preserve">10.7326/0003-4819-147-8-200710160-00010</w:t>
+        </w:r>
+      </w:hyperlink>
+    </w:p>
+    <w:bookmarkEnd w:id="76"/>
+    <w:bookmarkEnd w:id="77"/>
+    <w:bookmarkEnd w:id="78"/>
     <w:sectPr>
       <w:footnotePr>
         <w:numRestart w:val="eachSect"/>

</xml_diff>